<commit_message>
tex2docx: size table columns by content; side-by-side columns keep source widths
Co-Authored-By: Claude Opus 5.5 <noreply@anthropic.com>
Claude-Session: https://claude.ai/code/session_015WVgZKTbSWpZTjn6aZsqC9
</commit_message>
<xml_diff>
--- a/documents/arithmetique/molakhas_arith_3as.docx
+++ b/documents/arithmetique/molakhas_arith_3as.docx
@@ -17155,7 +17155,7 @@
           <w:tbl>
             <w:tblPr>
               <w:tblStyle w:val="Table"/>
-              <w:tblW w:type="auto" w:w="0"/>
+              <w:tblW w:w="4125" w:type="dxa"/>
               <w:jc w:val="center"/>
               <w:tblBorders>
                 <w:top w:val="single" w:sz="4" w:space="0" w:color="000000"/>
@@ -17165,15 +17165,15 @@
                 <w:insideH w:val="single" w:sz="4" w:space="0" w:color="000000"/>
                 <w:insideV w:val="single" w:sz="4" w:space="0" w:color="000000"/>
               </w:tblBorders>
-              <w:tblLayout w:type="autofit"/>
+              <w:tblLayout w:type="fixed"/>
               <w:tblLook w:firstRow="1" w:lastRow="0" w:firstColumn="0" w:lastColumn="0" w:noHBand="0" w:noVBand="0" w:val="0020"/>
             </w:tblPr>
             <w:tblGrid>
-              <w:gridCol w:w="1584"/>
-              <w:gridCol w:w="1584"/>
-              <w:gridCol w:w="1584"/>
-              <w:gridCol w:w="1584"/>
-              <w:gridCol w:w="1584"/>
+              <w:gridCol w:w="1125"/>
+              <w:gridCol w:w="525"/>
+              <w:gridCol w:w="825"/>
+              <w:gridCol w:w="825"/>
+              <w:gridCol w:w="825"/>
             </w:tblGrid>
             <w:tr>
               <w:trPr>
@@ -17181,6 +17181,7 @@
               </w:trPr>
               <w:tc>
                 <w:tcPr>
+                  <w:tcW w:w="1125" w:type="dxa"/>
                   <w:shd w:val="clear" w:color="auto" w:fill="E4E7ED"/>
                 </w:tcPr>
                 <w:p>
@@ -17210,6 +17211,7 @@
               </w:tc>
               <w:tc>
                 <w:tcPr>
+                  <w:tcW w:w="525" w:type="dxa"/>
                   <w:shd w:val="clear" w:color="auto" w:fill="E4E7ED"/>
                 </w:tcPr>
                 <w:p>
@@ -17230,6 +17232,7 @@
               </w:tc>
               <w:tc>
                 <w:tcPr>
+                  <w:tcW w:w="825" w:type="dxa"/>
                   <w:shd w:val="clear" w:color="auto" w:fill="E4E7ED"/>
                 </w:tcPr>
                 <w:p>
@@ -17259,6 +17262,7 @@
               </w:tc>
               <w:tc>
                 <w:tcPr>
+                  <w:tcW w:w="825" w:type="dxa"/>
                   <w:shd w:val="clear" w:color="auto" w:fill="E4E7ED"/>
                 </w:tcPr>
                 <w:p>
@@ -17288,6 +17292,7 @@
               </w:tc>
               <w:tc>
                 <w:tcPr>
+                  <w:tcW w:w="825" w:type="dxa"/>
                   <w:shd w:val="clear" w:color="auto" w:fill="E4E7ED"/>
                 </w:tcPr>
                 <w:p>
@@ -17318,7 +17323,9 @@
             </w:tr>
             <w:tr>
               <w:tc>
-                <w:tcPr/>
+                <w:tcPr>
+                  <w:tcW w:w="1125" w:type="dxa"/>
+                </w:tcPr>
                 <w:p>
                   <w:pPr>
                     <w:pStyle w:val="Compact"/>
@@ -17370,7 +17377,9 @@
                 </w:p>
               </w:tc>
               <w:tc>
-                <w:tcPr/>
+                <w:tcPr>
+                  <w:tcW w:w="525" w:type="dxa"/>
+                </w:tcPr>
                 <w:p>
                   <w:pPr>
                     <w:pStyle w:val="Compact"/>
@@ -17385,7 +17394,9 @@
                 </w:p>
               </w:tc>
               <w:tc>
-                <w:tcPr/>
+                <w:tcPr>
+                  <w:tcW w:w="825" w:type="dxa"/>
+                </w:tcPr>
                 <w:p>
                   <w:pPr>
                     <w:pStyle w:val="Compact"/>
@@ -17400,7 +17411,9 @@
                 </w:p>
               </w:tc>
               <w:tc>
-                <w:tcPr/>
+                <w:tcPr>
+                  <w:tcW w:w="825" w:type="dxa"/>
+                </w:tcPr>
                 <w:p>
                   <w:pPr>
                     <w:pStyle w:val="Compact"/>
@@ -17415,7 +17428,9 @@
                 </w:p>
               </w:tc>
               <w:tc>
-                <w:tcPr/>
+                <w:tcPr>
+                  <w:tcW w:w="825" w:type="dxa"/>
+                </w:tcPr>
                 <w:p>
                   <w:pPr>
                     <w:pStyle w:val="Compact"/>
@@ -17915,7 +17930,7 @@
           <w:tbl>
             <w:tblPr>
               <w:tblStyle w:val="Table"/>
-              <w:tblW w:type="auto" w:w="0"/>
+              <w:tblW w:w="3300" w:type="dxa"/>
               <w:jc w:val="center"/>
               <w:tblBorders>
                 <w:top w:val="single" w:sz="4" w:space="0" w:color="000000"/>
@@ -17925,14 +17940,14 @@
                 <w:insideH w:val="single" w:sz="4" w:space="0" w:color="000000"/>
                 <w:insideV w:val="single" w:sz="4" w:space="0" w:color="000000"/>
               </w:tblBorders>
-              <w:tblLayout w:type="autofit"/>
+              <w:tblLayout w:type="fixed"/>
               <w:tblLook w:firstRow="1" w:lastRow="0" w:firstColumn="0" w:lastColumn="0" w:noHBand="0" w:noVBand="0" w:val="0020"/>
             </w:tblPr>
             <w:tblGrid>
-              <w:gridCol w:w="1980"/>
-              <w:gridCol w:w="1980"/>
-              <w:gridCol w:w="1980"/>
-              <w:gridCol w:w="1980"/>
+              <w:gridCol w:w="1125"/>
+              <w:gridCol w:w="525"/>
+              <w:gridCol w:w="825"/>
+              <w:gridCol w:w="825"/>
             </w:tblGrid>
             <w:tr>
               <w:trPr>
@@ -17940,6 +17955,7 @@
               </w:trPr>
               <w:tc>
                 <w:tcPr>
+                  <w:tcW w:w="1125" w:type="dxa"/>
                   <w:shd w:val="clear" w:color="auto" w:fill="E4E7ED"/>
                 </w:tcPr>
                 <w:p>
@@ -17969,6 +17985,7 @@
               </w:tc>
               <w:tc>
                 <w:tcPr>
+                  <w:tcW w:w="525" w:type="dxa"/>
                   <w:shd w:val="clear" w:color="auto" w:fill="E4E7ED"/>
                 </w:tcPr>
                 <w:p>
@@ -17989,6 +18006,7 @@
               </w:tc>
               <w:tc>
                 <w:tcPr>
+                  <w:tcW w:w="825" w:type="dxa"/>
                   <w:shd w:val="clear" w:color="auto" w:fill="E4E7ED"/>
                 </w:tcPr>
                 <w:p>
@@ -18018,6 +18036,7 @@
               </w:tc>
               <w:tc>
                 <w:tcPr>
+                  <w:tcW w:w="825" w:type="dxa"/>
                   <w:shd w:val="clear" w:color="auto" w:fill="E4E7ED"/>
                 </w:tcPr>
                 <w:p>
@@ -18048,7 +18067,9 @@
             </w:tr>
             <w:tr>
               <w:tc>
-                <w:tcPr/>
+                <w:tcPr>
+                  <w:tcW w:w="1125" w:type="dxa"/>
+                </w:tcPr>
                 <w:p>
                   <w:pPr>
                     <w:pStyle w:val="Compact"/>
@@ -18100,7 +18121,9 @@
                 </w:p>
               </w:tc>
               <w:tc>
-                <w:tcPr/>
+                <w:tcPr>
+                  <w:tcW w:w="525" w:type="dxa"/>
+                </w:tcPr>
                 <w:p>
                   <w:pPr>
                     <w:pStyle w:val="Compact"/>
@@ -18115,7 +18138,9 @@
                 </w:p>
               </w:tc>
               <w:tc>
-                <w:tcPr/>
+                <w:tcPr>
+                  <w:tcW w:w="825" w:type="dxa"/>
+                </w:tcPr>
                 <w:p>
                   <w:pPr>
                     <w:pStyle w:val="Compact"/>
@@ -18130,7 +18155,9 @@
                 </w:p>
               </w:tc>
               <w:tc>
-                <w:tcPr/>
+                <w:tcPr>
+                  <w:tcW w:w="825" w:type="dxa"/>
+                </w:tcPr>
                 <w:p>
                   <w:pPr>
                     <w:pStyle w:val="Compact"/>
@@ -18744,7 +18771,7 @@
           <w:tbl>
             <w:tblPr>
               <w:tblStyle w:val="Table"/>
-              <w:tblW w:type="auto" w:w="0"/>
+              <w:tblW w:w="5100" w:type="dxa"/>
               <w:jc w:val="center"/>
               <w:tblBorders>
                 <w:top w:val="single" w:sz="4" w:space="0" w:color="000000"/>
@@ -18754,16 +18781,16 @@
                 <w:insideH w:val="single" w:sz="4" w:space="0" w:color="000000"/>
                 <w:insideV w:val="single" w:sz="4" w:space="0" w:color="000000"/>
               </w:tblBorders>
-              <w:tblLayout w:type="autofit"/>
+              <w:tblLayout w:type="fixed"/>
               <w:tblLook w:firstRow="1" w:lastRow="0" w:firstColumn="0" w:lastColumn="0" w:noHBand="0" w:noVBand="0" w:val="0020"/>
             </w:tblPr>
             <w:tblGrid>
-              <w:gridCol w:w="1320"/>
-              <w:gridCol w:w="1320"/>
-              <w:gridCol w:w="1320"/>
-              <w:gridCol w:w="1320"/>
-              <w:gridCol w:w="1320"/>
-              <w:gridCol w:w="1320"/>
+              <w:gridCol w:w="1275"/>
+              <w:gridCol w:w="525"/>
+              <w:gridCol w:w="825"/>
+              <w:gridCol w:w="825"/>
+              <w:gridCol w:w="825"/>
+              <w:gridCol w:w="825"/>
             </w:tblGrid>
             <w:tr>
               <w:trPr>
@@ -18771,6 +18798,7 @@
               </w:trPr>
               <w:tc>
                 <w:tcPr>
+                  <w:tcW w:w="1275" w:type="dxa"/>
                   <w:shd w:val="clear" w:color="auto" w:fill="E4E7ED"/>
                 </w:tcPr>
                 <w:p>
@@ -18800,6 +18828,7 @@
               </w:tc>
               <w:tc>
                 <w:tcPr>
+                  <w:tcW w:w="525" w:type="dxa"/>
                   <w:shd w:val="clear" w:color="auto" w:fill="E4E7ED"/>
                 </w:tcPr>
                 <w:p>
@@ -18820,6 +18849,7 @@
               </w:tc>
               <w:tc>
                 <w:tcPr>
+                  <w:tcW w:w="825" w:type="dxa"/>
                   <w:shd w:val="clear" w:color="auto" w:fill="E4E7ED"/>
                 </w:tcPr>
                 <w:p>
@@ -18849,6 +18879,7 @@
               </w:tc>
               <w:tc>
                 <w:tcPr>
+                  <w:tcW w:w="825" w:type="dxa"/>
                   <w:shd w:val="clear" w:color="auto" w:fill="E4E7ED"/>
                 </w:tcPr>
                 <w:p>
@@ -18878,6 +18909,7 @@
               </w:tc>
               <w:tc>
                 <w:tcPr>
+                  <w:tcW w:w="825" w:type="dxa"/>
                   <w:shd w:val="clear" w:color="auto" w:fill="E4E7ED"/>
                 </w:tcPr>
                 <w:p>
@@ -18907,6 +18939,7 @@
               </w:tc>
               <w:tc>
                 <w:tcPr>
+                  <w:tcW w:w="825" w:type="dxa"/>
                   <w:shd w:val="clear" w:color="auto" w:fill="E4E7ED"/>
                 </w:tcPr>
                 <w:p>
@@ -18937,7 +18970,9 @@
             </w:tr>
             <w:tr>
               <w:tc>
-                <w:tcPr/>
+                <w:tcPr>
+                  <w:tcW w:w="1275" w:type="dxa"/>
+                </w:tcPr>
                 <w:p>
                   <w:pPr>
                     <w:pStyle w:val="Compact"/>
@@ -18989,7 +19024,9 @@
                 </w:p>
               </w:tc>
               <w:tc>
-                <w:tcPr/>
+                <w:tcPr>
+                  <w:tcW w:w="525" w:type="dxa"/>
+                </w:tcPr>
                 <w:p>
                   <w:pPr>
                     <w:pStyle w:val="Compact"/>
@@ -19004,7 +19041,9 @@
                 </w:p>
               </w:tc>
               <w:tc>
-                <w:tcPr/>
+                <w:tcPr>
+                  <w:tcW w:w="825" w:type="dxa"/>
+                </w:tcPr>
                 <w:p>
                   <w:pPr>
                     <w:pStyle w:val="Compact"/>
@@ -19019,7 +19058,9 @@
                 </w:p>
               </w:tc>
               <w:tc>
-                <w:tcPr/>
+                <w:tcPr>
+                  <w:tcW w:w="825" w:type="dxa"/>
+                </w:tcPr>
                 <w:p>
                   <w:pPr>
                     <w:pStyle w:val="Compact"/>
@@ -19034,7 +19075,9 @@
                 </w:p>
               </w:tc>
               <w:tc>
-                <w:tcPr/>
+                <w:tcPr>
+                  <w:tcW w:w="825" w:type="dxa"/>
+                </w:tcPr>
                 <w:p>
                   <w:pPr>
                     <w:pStyle w:val="Compact"/>
@@ -19049,7 +19092,9 @@
                 </w:p>
               </w:tc>
               <w:tc>
-                <w:tcPr/>
+                <w:tcPr>
+                  <w:tcW w:w="825" w:type="dxa"/>
+                </w:tcPr>
                 <w:p>
                   <w:pPr>
                     <w:pStyle w:val="Compact"/>
@@ -21630,7 +21675,7 @@
           <w:tbl>
             <w:tblPr>
               <w:tblStyle w:val="Table"/>
-              <w:tblW w:type="auto" w:w="0"/>
+              <w:tblW w:w="5325" w:type="dxa"/>
               <w:jc w:val="center"/>
               <w:tblBorders>
                 <w:top w:val="single" w:sz="4" w:space="0" w:color="000000"/>
@@ -21640,20 +21685,20 @@
                 <w:insideH w:val="single" w:sz="4" w:space="0" w:color="000000"/>
                 <w:insideV w:val="single" w:sz="4" w:space="0" w:color="000000"/>
               </w:tblBorders>
-              <w:tblLayout w:type="autofit"/>
+              <w:tblLayout w:type="fixed"/>
               <w:tblLook w:firstRow="1" w:lastRow="0" w:firstColumn="0" w:lastColumn="0" w:noHBand="0" w:noVBand="0" w:val="0020"/>
             </w:tblPr>
             <w:tblGrid>
-              <w:gridCol w:w="792"/>
-              <w:gridCol w:w="792"/>
-              <w:gridCol w:w="792"/>
-              <w:gridCol w:w="792"/>
-              <w:gridCol w:w="792"/>
-              <w:gridCol w:w="792"/>
-              <w:gridCol w:w="792"/>
-              <w:gridCol w:w="792"/>
-              <w:gridCol w:w="792"/>
-              <w:gridCol w:w="792"/>
+              <w:gridCol w:w="1275"/>
+              <w:gridCol w:w="450"/>
+              <w:gridCol w:w="450"/>
+              <w:gridCol w:w="450"/>
+              <w:gridCol w:w="450"/>
+              <w:gridCol w:w="450"/>
+              <w:gridCol w:w="450"/>
+              <w:gridCol w:w="450"/>
+              <w:gridCol w:w="450"/>
+              <w:gridCol w:w="450"/>
             </w:tblGrid>
             <w:tr>
               <w:trPr>
@@ -21661,6 +21706,7 @@
               </w:trPr>
               <w:tc>
                 <w:tcPr>
+                  <w:tcW w:w="1275" w:type="dxa"/>
                   <w:shd w:val="clear" w:color="auto" w:fill="E4E7ED"/>
                 </w:tcPr>
                 <w:p>
@@ -21712,6 +21758,7 @@
               </w:tc>
               <w:tc>
                 <w:tcPr>
+                  <w:tcW w:w="450" w:type="dxa"/>
                   <w:shd w:val="clear" w:color="auto" w:fill="E4E7ED"/>
                 </w:tcPr>
                 <w:p>
@@ -21729,6 +21776,7 @@
               </w:tc>
               <w:tc>
                 <w:tcPr>
+                  <w:tcW w:w="450" w:type="dxa"/>
                   <w:shd w:val="clear" w:color="auto" w:fill="E4E7ED"/>
                 </w:tcPr>
                 <w:p>
@@ -21746,6 +21794,7 @@
               </w:tc>
               <w:tc>
                 <w:tcPr>
+                  <w:tcW w:w="450" w:type="dxa"/>
                   <w:shd w:val="clear" w:color="auto" w:fill="E4E7ED"/>
                 </w:tcPr>
                 <w:p>
@@ -21763,6 +21812,7 @@
               </w:tc>
               <w:tc>
                 <w:tcPr>
+                  <w:tcW w:w="450" w:type="dxa"/>
                   <w:shd w:val="clear" w:color="auto" w:fill="E4E7ED"/>
                 </w:tcPr>
                 <w:p>
@@ -21780,6 +21830,7 @@
               </w:tc>
               <w:tc>
                 <w:tcPr>
+                  <w:tcW w:w="450" w:type="dxa"/>
                   <w:shd w:val="clear" w:color="auto" w:fill="E4E7ED"/>
                 </w:tcPr>
                 <w:p>
@@ -21797,6 +21848,7 @@
               </w:tc>
               <w:tc>
                 <w:tcPr>
+                  <w:tcW w:w="450" w:type="dxa"/>
                   <w:shd w:val="clear" w:color="auto" w:fill="E4E7ED"/>
                 </w:tcPr>
                 <w:p>
@@ -21814,6 +21866,7 @@
               </w:tc>
               <w:tc>
                 <w:tcPr>
+                  <w:tcW w:w="450" w:type="dxa"/>
                   <w:shd w:val="clear" w:color="auto" w:fill="E4E7ED"/>
                 </w:tcPr>
                 <w:p>
@@ -21831,6 +21884,7 @@
               </w:tc>
               <w:tc>
                 <w:tcPr>
+                  <w:tcW w:w="450" w:type="dxa"/>
                   <w:shd w:val="clear" w:color="auto" w:fill="E4E7ED"/>
                 </w:tcPr>
                 <w:p>
@@ -21848,6 +21902,7 @@
               </w:tc>
               <w:tc>
                 <w:tcPr>
+                  <w:tcW w:w="450" w:type="dxa"/>
                   <w:shd w:val="clear" w:color="auto" w:fill="E4E7ED"/>
                 </w:tcPr>
                 <w:p>
@@ -21866,7 +21921,9 @@
             </w:tr>
             <w:tr>
               <w:tc>
-                <w:tcPr/>
+                <w:tcPr>
+                  <w:tcW w:w="1275" w:type="dxa"/>
+                </w:tcPr>
                 <w:p>
                   <w:pPr>
                     <w:pStyle w:val="Compact"/>
@@ -21918,7 +21975,9 @@
                 </w:p>
               </w:tc>
               <w:tc>
-                <w:tcPr/>
+                <w:tcPr>
+                  <w:tcW w:w="450" w:type="dxa"/>
+                </w:tcPr>
                 <w:p>
                   <w:pPr>
                     <w:pStyle w:val="Compact"/>
@@ -21933,7 +21992,9 @@
                 </w:p>
               </w:tc>
               <w:tc>
-                <w:tcPr/>
+                <w:tcPr>
+                  <w:tcW w:w="450" w:type="dxa"/>
+                </w:tcPr>
                 <w:p>
                   <w:pPr>
                     <w:pStyle w:val="Compact"/>
@@ -21948,7 +22009,9 @@
                 </w:p>
               </w:tc>
               <w:tc>
-                <w:tcPr/>
+                <w:tcPr>
+                  <w:tcW w:w="450" w:type="dxa"/>
+                </w:tcPr>
                 <w:p>
                   <w:pPr>
                     <w:pStyle w:val="Compact"/>
@@ -21963,7 +22026,9 @@
                 </w:p>
               </w:tc>
               <w:tc>
-                <w:tcPr/>
+                <w:tcPr>
+                  <w:tcW w:w="450" w:type="dxa"/>
+                </w:tcPr>
                 <w:p>
                   <w:pPr>
                     <w:pStyle w:val="Compact"/>
@@ -21978,7 +22043,9 @@
                 </w:p>
               </w:tc>
               <w:tc>
-                <w:tcPr/>
+                <w:tcPr>
+                  <w:tcW w:w="450" w:type="dxa"/>
+                </w:tcPr>
                 <w:p>
                   <w:pPr>
                     <w:pStyle w:val="Compact"/>
@@ -21993,7 +22060,9 @@
                 </w:p>
               </w:tc>
               <w:tc>
-                <w:tcPr/>
+                <w:tcPr>
+                  <w:tcW w:w="450" w:type="dxa"/>
+                </w:tcPr>
                 <w:p>
                   <w:pPr>
                     <w:pStyle w:val="Compact"/>
@@ -22008,7 +22077,9 @@
                 </w:p>
               </w:tc>
               <w:tc>
-                <w:tcPr/>
+                <w:tcPr>
+                  <w:tcW w:w="450" w:type="dxa"/>
+                </w:tcPr>
                 <w:p>
                   <w:pPr>
                     <w:pStyle w:val="Compact"/>
@@ -22023,7 +22094,9 @@
                 </w:p>
               </w:tc>
               <w:tc>
-                <w:tcPr/>
+                <w:tcPr>
+                  <w:tcW w:w="450" w:type="dxa"/>
+                </w:tcPr>
                 <w:p>
                   <w:pPr>
                     <w:pStyle w:val="Compact"/>
@@ -22038,7 +22111,9 @@
                 </w:p>
               </w:tc>
               <w:tc>
-                <w:tcPr/>
+                <w:tcPr>
+                  <w:tcW w:w="450" w:type="dxa"/>
+                </w:tcPr>
                 <w:p>
                   <w:pPr>
                     <w:pStyle w:val="Compact"/>
@@ -22055,7 +22130,9 @@
             </w:tr>
             <w:tr>
               <w:tc>
-                <w:tcPr/>
+                <w:tcPr>
+                  <w:tcW w:w="1275" w:type="dxa"/>
+                </w:tcPr>
                 <w:p>
                   <w:pPr>
                     <w:pStyle w:val="Compact"/>
@@ -22110,7 +22187,9 @@
                 </w:p>
               </w:tc>
               <w:tc>
-                <w:tcPr/>
+                <w:tcPr>
+                  <w:tcW w:w="450" w:type="dxa"/>
+                </w:tcPr>
                 <w:p>
                   <w:pPr>
                     <w:pStyle w:val="Compact"/>
@@ -22125,7 +22204,9 @@
                 </w:p>
               </w:tc>
               <w:tc>
-                <w:tcPr/>
+                <w:tcPr>
+                  <w:tcW w:w="450" w:type="dxa"/>
+                </w:tcPr>
                 <w:p>
                   <w:pPr>
                     <w:pStyle w:val="Compact"/>
@@ -22140,7 +22221,9 @@
                 </w:p>
               </w:tc>
               <w:tc>
-                <w:tcPr/>
+                <w:tcPr>
+                  <w:tcW w:w="450" w:type="dxa"/>
+                </w:tcPr>
                 <w:p>
                   <w:pPr>
                     <w:pStyle w:val="Compact"/>
@@ -22155,7 +22238,9 @@
                 </w:p>
               </w:tc>
               <w:tc>
-                <w:tcPr/>
+                <w:tcPr>
+                  <w:tcW w:w="450" w:type="dxa"/>
+                </w:tcPr>
                 <w:p>
                   <w:pPr>
                     <w:pStyle w:val="Compact"/>
@@ -22170,7 +22255,9 @@
                 </w:p>
               </w:tc>
               <w:tc>
-                <w:tcPr/>
+                <w:tcPr>
+                  <w:tcW w:w="450" w:type="dxa"/>
+                </w:tcPr>
                 <w:p>
                   <w:pPr>
                     <w:pStyle w:val="Compact"/>
@@ -22185,7 +22272,9 @@
                 </w:p>
               </w:tc>
               <w:tc>
-                <w:tcPr/>
+                <w:tcPr>
+                  <w:tcW w:w="450" w:type="dxa"/>
+                </w:tcPr>
                 <w:p>
                   <w:pPr>
                     <w:pStyle w:val="Compact"/>
@@ -22200,7 +22289,9 @@
                 </w:p>
               </w:tc>
               <w:tc>
-                <w:tcPr/>
+                <w:tcPr>
+                  <w:tcW w:w="450" w:type="dxa"/>
+                </w:tcPr>
                 <w:p>
                   <w:pPr>
                     <w:pStyle w:val="Compact"/>
@@ -22215,7 +22306,9 @@
                 </w:p>
               </w:tc>
               <w:tc>
-                <w:tcPr/>
+                <w:tcPr>
+                  <w:tcW w:w="450" w:type="dxa"/>
+                </w:tcPr>
                 <w:p>
                   <w:pPr>
                     <w:pStyle w:val="Compact"/>
@@ -22230,7 +22323,9 @@
                 </w:p>
               </w:tc>
               <w:tc>
-                <w:tcPr/>
+                <w:tcPr>
+                  <w:tcW w:w="450" w:type="dxa"/>
+                </w:tcPr>
                 <w:p>
                   <w:pPr>
                     <w:pStyle w:val="Compact"/>
@@ -42515,7 +42610,7 @@
           <w:tbl>
             <w:tblPr>
               <w:tblStyle w:val="Table"/>
-              <w:tblW w:type="auto" w:w="0"/>
+              <w:tblW w:w="3300" w:type="dxa"/>
               <w:jc w:val="center"/>
               <w:tblBorders>
                 <w:top w:val="single" w:sz="4" w:space="0" w:color="000000"/>
@@ -42525,14 +42620,14 @@
                 <w:insideH w:val="single" w:sz="4" w:space="0" w:color="000000"/>
                 <w:insideV w:val="single" w:sz="4" w:space="0" w:color="000000"/>
               </w:tblBorders>
-              <w:tblLayout w:type="autofit"/>
+              <w:tblLayout w:type="fixed"/>
               <w:tblLook w:firstRow="1" w:lastRow="0" w:firstColumn="0" w:lastColumn="0" w:noHBand="0" w:noVBand="0" w:val="0020"/>
             </w:tblPr>
             <w:tblGrid>
-              <w:gridCol w:w="1980"/>
-              <w:gridCol w:w="1980"/>
-              <w:gridCol w:w="1980"/>
-              <w:gridCol w:w="1980"/>
+              <w:gridCol w:w="1125"/>
+              <w:gridCol w:w="525"/>
+              <w:gridCol w:w="825"/>
+              <w:gridCol w:w="825"/>
             </w:tblGrid>
             <w:tr>
               <w:trPr>
@@ -42540,6 +42635,7 @@
               </w:trPr>
               <w:tc>
                 <w:tcPr>
+                  <w:tcW w:w="1125" w:type="dxa"/>
                   <w:shd w:val="clear" w:color="auto" w:fill="E4E7ED"/>
                 </w:tcPr>
                 <w:p>
@@ -42569,6 +42665,7 @@
               </w:tc>
               <w:tc>
                 <w:tcPr>
+                  <w:tcW w:w="525" w:type="dxa"/>
                   <w:shd w:val="clear" w:color="auto" w:fill="E4E7ED"/>
                 </w:tcPr>
                 <w:p>
@@ -42589,6 +42686,7 @@
               </w:tc>
               <w:tc>
                 <w:tcPr>
+                  <w:tcW w:w="825" w:type="dxa"/>
                   <w:shd w:val="clear" w:color="auto" w:fill="E4E7ED"/>
                 </w:tcPr>
                 <w:p>
@@ -42618,6 +42716,7 @@
               </w:tc>
               <w:tc>
                 <w:tcPr>
+                  <w:tcW w:w="825" w:type="dxa"/>
                   <w:shd w:val="clear" w:color="auto" w:fill="E4E7ED"/>
                 </w:tcPr>
                 <w:p>
@@ -42648,7 +42747,9 @@
             </w:tr>
             <w:tr>
               <w:tc>
-                <w:tcPr/>
+                <w:tcPr>
+                  <w:tcW w:w="1125" w:type="dxa"/>
+                </w:tcPr>
                 <w:p>
                   <w:pPr>
                     <w:pStyle w:val="Compact"/>
@@ -42700,7 +42801,9 @@
                 </w:p>
               </w:tc>
               <w:tc>
-                <w:tcPr/>
+                <w:tcPr>
+                  <w:tcW w:w="525" w:type="dxa"/>
+                </w:tcPr>
                 <w:p>
                   <w:pPr>
                     <w:pStyle w:val="Compact"/>
@@ -42715,7 +42818,9 @@
                 </w:p>
               </w:tc>
               <w:tc>
-                <w:tcPr/>
+                <w:tcPr>
+                  <w:tcW w:w="825" w:type="dxa"/>
+                </w:tcPr>
                 <w:p>
                   <w:pPr>
                     <w:pStyle w:val="Compact"/>
@@ -42730,7 +42835,9 @@
                 </w:p>
               </w:tc>
               <w:tc>
-                <w:tcPr/>
+                <w:tcPr>
+                  <w:tcW w:w="825" w:type="dxa"/>
+                </w:tcPr>
                 <w:p>
                   <w:pPr>
                     <w:pStyle w:val="Compact"/>

</xml_diff>

<commit_message>
tex2docx: wider content-based columns; keep space between adjacent tables
Co-Authored-By: Claude Opus 5.5 <noreply@anthropic.com>
Claude-Session: https://claude.ai/code/session_015WVgZKTbSWpZTjn6aZsqC9
</commit_message>
<xml_diff>
--- a/documents/arithmetique/molakhas_arith_3as.docx
+++ b/documents/arithmetique/molakhas_arith_3as.docx
@@ -79,6 +79,7 @@
     <w:p>
       <w:pPr>
         <w:bidi/>
+        <w:spacing w:before="120"/>
       </w:pPr>
     </w:p>
     <w:tbl>
@@ -17155,7 +17156,7 @@
           <w:tbl>
             <w:tblPr>
               <w:tblStyle w:val="Table"/>
-              <w:tblW w:w="4125" w:type="dxa"/>
+              <w:tblW w:w="6725" w:type="dxa"/>
               <w:jc w:val="center"/>
               <w:tblBorders>
                 <w:top w:val="single" w:sz="4" w:space="0" w:color="000000"/>
@@ -17169,11 +17170,11 @@
               <w:tblLook w:firstRow="1" w:lastRow="0" w:firstColumn="0" w:lastColumn="0" w:noHBand="0" w:noVBand="0" w:val="0020"/>
             </w:tblPr>
             <w:tblGrid>
-              <w:gridCol w:w="1125"/>
-              <w:gridCol w:w="525"/>
-              <w:gridCol w:w="825"/>
-              <w:gridCol w:w="825"/>
-              <w:gridCol w:w="825"/>
+              <w:gridCol w:w="1725"/>
+              <w:gridCol w:w="965"/>
+              <w:gridCol w:w="1345"/>
+              <w:gridCol w:w="1345"/>
+              <w:gridCol w:w="1345"/>
             </w:tblGrid>
             <w:tr>
               <w:trPr>
@@ -17181,7 +17182,7 @@
               </w:trPr>
               <w:tc>
                 <w:tcPr>
-                  <w:tcW w:w="1125" w:type="dxa"/>
+                  <w:tcW w:w="1725" w:type="dxa"/>
                   <w:shd w:val="clear" w:color="auto" w:fill="E4E7ED"/>
                 </w:tcPr>
                 <w:p>
@@ -17211,7 +17212,7 @@
               </w:tc>
               <w:tc>
                 <w:tcPr>
-                  <w:tcW w:w="525" w:type="dxa"/>
+                  <w:tcW w:w="965" w:type="dxa"/>
                   <w:shd w:val="clear" w:color="auto" w:fill="E4E7ED"/>
                 </w:tcPr>
                 <w:p>
@@ -17232,7 +17233,7 @@
               </w:tc>
               <w:tc>
                 <w:tcPr>
-                  <w:tcW w:w="825" w:type="dxa"/>
+                  <w:tcW w:w="1345" w:type="dxa"/>
                   <w:shd w:val="clear" w:color="auto" w:fill="E4E7ED"/>
                 </w:tcPr>
                 <w:p>
@@ -17262,7 +17263,7 @@
               </w:tc>
               <w:tc>
                 <w:tcPr>
-                  <w:tcW w:w="825" w:type="dxa"/>
+                  <w:tcW w:w="1345" w:type="dxa"/>
                   <w:shd w:val="clear" w:color="auto" w:fill="E4E7ED"/>
                 </w:tcPr>
                 <w:p>
@@ -17292,7 +17293,7 @@
               </w:tc>
               <w:tc>
                 <w:tcPr>
-                  <w:tcW w:w="825" w:type="dxa"/>
+                  <w:tcW w:w="1345" w:type="dxa"/>
                   <w:shd w:val="clear" w:color="auto" w:fill="E4E7ED"/>
                 </w:tcPr>
                 <w:p>
@@ -17324,7 +17325,7 @@
             <w:tr>
               <w:tc>
                 <w:tcPr>
-                  <w:tcW w:w="1125" w:type="dxa"/>
+                  <w:tcW w:w="1725" w:type="dxa"/>
                 </w:tcPr>
                 <w:p>
                   <w:pPr>
@@ -17378,7 +17379,7 @@
               </w:tc>
               <w:tc>
                 <w:tcPr>
-                  <w:tcW w:w="525" w:type="dxa"/>
+                  <w:tcW w:w="965" w:type="dxa"/>
                 </w:tcPr>
                 <w:p>
                   <w:pPr>
@@ -17395,7 +17396,7 @@
               </w:tc>
               <w:tc>
                 <w:tcPr>
-                  <w:tcW w:w="825" w:type="dxa"/>
+                  <w:tcW w:w="1345" w:type="dxa"/>
                 </w:tcPr>
                 <w:p>
                   <w:pPr>
@@ -17412,7 +17413,7 @@
               </w:tc>
               <w:tc>
                 <w:tcPr>
-                  <w:tcW w:w="825" w:type="dxa"/>
+                  <w:tcW w:w="1345" w:type="dxa"/>
                 </w:tcPr>
                 <w:p>
                   <w:pPr>
@@ -17429,7 +17430,7 @@
               </w:tc>
               <w:tc>
                 <w:tcPr>
-                  <w:tcW w:w="825" w:type="dxa"/>
+                  <w:tcW w:w="1345" w:type="dxa"/>
                 </w:tcPr>
                 <w:p>
                   <w:pPr>
@@ -17449,6 +17450,7 @@
           <w:p>
             <w:pPr>
               <w:bidi/>
+              <w:spacing w:before="120"/>
             </w:pPr>
             <w:r>
               <w:rPr>
@@ -17930,7 +17932,7 @@
           <w:tbl>
             <w:tblPr>
               <w:tblStyle w:val="Table"/>
-              <w:tblW w:w="3300" w:type="dxa"/>
+              <w:tblW w:w="5380" w:type="dxa"/>
               <w:jc w:val="center"/>
               <w:tblBorders>
                 <w:top w:val="single" w:sz="4" w:space="0" w:color="000000"/>
@@ -17944,10 +17946,10 @@
               <w:tblLook w:firstRow="1" w:lastRow="0" w:firstColumn="0" w:lastColumn="0" w:noHBand="0" w:noVBand="0" w:val="0020"/>
             </w:tblPr>
             <w:tblGrid>
-              <w:gridCol w:w="1125"/>
-              <w:gridCol w:w="525"/>
-              <w:gridCol w:w="825"/>
-              <w:gridCol w:w="825"/>
+              <w:gridCol w:w="1725"/>
+              <w:gridCol w:w="965"/>
+              <w:gridCol w:w="1345"/>
+              <w:gridCol w:w="1345"/>
             </w:tblGrid>
             <w:tr>
               <w:trPr>
@@ -17955,7 +17957,7 @@
               </w:trPr>
               <w:tc>
                 <w:tcPr>
-                  <w:tcW w:w="1125" w:type="dxa"/>
+                  <w:tcW w:w="1725" w:type="dxa"/>
                   <w:shd w:val="clear" w:color="auto" w:fill="E4E7ED"/>
                 </w:tcPr>
                 <w:p>
@@ -17985,7 +17987,7 @@
               </w:tc>
               <w:tc>
                 <w:tcPr>
-                  <w:tcW w:w="525" w:type="dxa"/>
+                  <w:tcW w:w="965" w:type="dxa"/>
                   <w:shd w:val="clear" w:color="auto" w:fill="E4E7ED"/>
                 </w:tcPr>
                 <w:p>
@@ -18006,7 +18008,7 @@
               </w:tc>
               <w:tc>
                 <w:tcPr>
-                  <w:tcW w:w="825" w:type="dxa"/>
+                  <w:tcW w:w="1345" w:type="dxa"/>
                   <w:shd w:val="clear" w:color="auto" w:fill="E4E7ED"/>
                 </w:tcPr>
                 <w:p>
@@ -18036,7 +18038,7 @@
               </w:tc>
               <w:tc>
                 <w:tcPr>
-                  <w:tcW w:w="825" w:type="dxa"/>
+                  <w:tcW w:w="1345" w:type="dxa"/>
                   <w:shd w:val="clear" w:color="auto" w:fill="E4E7ED"/>
                 </w:tcPr>
                 <w:p>
@@ -18068,7 +18070,7 @@
             <w:tr>
               <w:tc>
                 <w:tcPr>
-                  <w:tcW w:w="1125" w:type="dxa"/>
+                  <w:tcW w:w="1725" w:type="dxa"/>
                 </w:tcPr>
                 <w:p>
                   <w:pPr>
@@ -18122,7 +18124,7 @@
               </w:tc>
               <w:tc>
                 <w:tcPr>
-                  <w:tcW w:w="525" w:type="dxa"/>
+                  <w:tcW w:w="965" w:type="dxa"/>
                 </w:tcPr>
                 <w:p>
                   <w:pPr>
@@ -18139,7 +18141,7 @@
               </w:tc>
               <w:tc>
                 <w:tcPr>
-                  <w:tcW w:w="825" w:type="dxa"/>
+                  <w:tcW w:w="1345" w:type="dxa"/>
                 </w:tcPr>
                 <w:p>
                   <w:pPr>
@@ -18156,7 +18158,7 @@
               </w:tc>
               <w:tc>
                 <w:tcPr>
-                  <w:tcW w:w="825" w:type="dxa"/>
+                  <w:tcW w:w="1345" w:type="dxa"/>
                 </w:tcPr>
                 <w:p>
                   <w:pPr>
@@ -18176,6 +18178,7 @@
           <w:p>
             <w:pPr>
               <w:bidi/>
+              <w:spacing w:before="120"/>
             </w:pPr>
             <w:r>
               <w:rPr>
@@ -18771,7 +18774,7 @@
           <w:tbl>
             <w:tblPr>
               <w:tblStyle w:val="Table"/>
-              <w:tblW w:w="5100" w:type="dxa"/>
+              <w:tblW w:w="8260" w:type="dxa"/>
               <w:jc w:val="center"/>
               <w:tblBorders>
                 <w:top w:val="single" w:sz="4" w:space="0" w:color="000000"/>
@@ -18785,12 +18788,12 @@
               <w:tblLook w:firstRow="1" w:lastRow="0" w:firstColumn="0" w:lastColumn="0" w:noHBand="0" w:noVBand="0" w:val="0020"/>
             </w:tblPr>
             <w:tblGrid>
-              <w:gridCol w:w="1275"/>
-              <w:gridCol w:w="525"/>
-              <w:gridCol w:w="825"/>
-              <w:gridCol w:w="825"/>
-              <w:gridCol w:w="825"/>
-              <w:gridCol w:w="825"/>
+              <w:gridCol w:w="1915"/>
+              <w:gridCol w:w="965"/>
+              <w:gridCol w:w="1345"/>
+              <w:gridCol w:w="1345"/>
+              <w:gridCol w:w="1345"/>
+              <w:gridCol w:w="1345"/>
             </w:tblGrid>
             <w:tr>
               <w:trPr>
@@ -18798,7 +18801,7 @@
               </w:trPr>
               <w:tc>
                 <w:tcPr>
-                  <w:tcW w:w="1275" w:type="dxa"/>
+                  <w:tcW w:w="1915" w:type="dxa"/>
                   <w:shd w:val="clear" w:color="auto" w:fill="E4E7ED"/>
                 </w:tcPr>
                 <w:p>
@@ -18828,7 +18831,7 @@
               </w:tc>
               <w:tc>
                 <w:tcPr>
-                  <w:tcW w:w="525" w:type="dxa"/>
+                  <w:tcW w:w="965" w:type="dxa"/>
                   <w:shd w:val="clear" w:color="auto" w:fill="E4E7ED"/>
                 </w:tcPr>
                 <w:p>
@@ -18849,7 +18852,7 @@
               </w:tc>
               <w:tc>
                 <w:tcPr>
-                  <w:tcW w:w="825" w:type="dxa"/>
+                  <w:tcW w:w="1345" w:type="dxa"/>
                   <w:shd w:val="clear" w:color="auto" w:fill="E4E7ED"/>
                 </w:tcPr>
                 <w:p>
@@ -18879,7 +18882,7 @@
               </w:tc>
               <w:tc>
                 <w:tcPr>
-                  <w:tcW w:w="825" w:type="dxa"/>
+                  <w:tcW w:w="1345" w:type="dxa"/>
                   <w:shd w:val="clear" w:color="auto" w:fill="E4E7ED"/>
                 </w:tcPr>
                 <w:p>
@@ -18909,7 +18912,7 @@
               </w:tc>
               <w:tc>
                 <w:tcPr>
-                  <w:tcW w:w="825" w:type="dxa"/>
+                  <w:tcW w:w="1345" w:type="dxa"/>
                   <w:shd w:val="clear" w:color="auto" w:fill="E4E7ED"/>
                 </w:tcPr>
                 <w:p>
@@ -18939,7 +18942,7 @@
               </w:tc>
               <w:tc>
                 <w:tcPr>
-                  <w:tcW w:w="825" w:type="dxa"/>
+                  <w:tcW w:w="1345" w:type="dxa"/>
                   <w:shd w:val="clear" w:color="auto" w:fill="E4E7ED"/>
                 </w:tcPr>
                 <w:p>
@@ -18971,7 +18974,7 @@
             <w:tr>
               <w:tc>
                 <w:tcPr>
-                  <w:tcW w:w="1275" w:type="dxa"/>
+                  <w:tcW w:w="1915" w:type="dxa"/>
                 </w:tcPr>
                 <w:p>
                   <w:pPr>
@@ -19025,7 +19028,7 @@
               </w:tc>
               <w:tc>
                 <w:tcPr>
-                  <w:tcW w:w="525" w:type="dxa"/>
+                  <w:tcW w:w="965" w:type="dxa"/>
                 </w:tcPr>
                 <w:p>
                   <w:pPr>
@@ -19042,7 +19045,7 @@
               </w:tc>
               <w:tc>
                 <w:tcPr>
-                  <w:tcW w:w="825" w:type="dxa"/>
+                  <w:tcW w:w="1345" w:type="dxa"/>
                 </w:tcPr>
                 <w:p>
                   <w:pPr>
@@ -19059,7 +19062,7 @@
               </w:tc>
               <w:tc>
                 <w:tcPr>
-                  <w:tcW w:w="825" w:type="dxa"/>
+                  <w:tcW w:w="1345" w:type="dxa"/>
                 </w:tcPr>
                 <w:p>
                   <w:pPr>
@@ -19076,7 +19079,7 @@
               </w:tc>
               <w:tc>
                 <w:tcPr>
-                  <w:tcW w:w="825" w:type="dxa"/>
+                  <w:tcW w:w="1345" w:type="dxa"/>
                 </w:tcPr>
                 <w:p>
                   <w:pPr>
@@ -19093,7 +19096,7 @@
               </w:tc>
               <w:tc>
                 <w:tcPr>
-                  <w:tcW w:w="825" w:type="dxa"/>
+                  <w:tcW w:w="1345" w:type="dxa"/>
                 </w:tcPr>
                 <w:p>
                   <w:pPr>
@@ -19113,6 +19116,7 @@
           <w:p>
             <w:pPr>
               <w:bidi/>
+              <w:spacing w:before="120"/>
             </w:pPr>
           </w:p>
         </w:tc>
@@ -21675,7 +21679,7 @@
           <w:tbl>
             <w:tblPr>
               <w:tblStyle w:val="Table"/>
-              <w:tblW w:w="5325" w:type="dxa"/>
+              <w:tblW w:w="9521" w:type="dxa"/>
               <w:jc w:val="center"/>
               <w:tblBorders>
                 <w:top w:val="single" w:sz="4" w:space="0" w:color="000000"/>
@@ -21689,16 +21693,16 @@
               <w:tblLook w:firstRow="1" w:lastRow="0" w:firstColumn="0" w:lastColumn="0" w:noHBand="0" w:noVBand="0" w:val="0020"/>
             </w:tblPr>
             <w:tblGrid>
-              <w:gridCol w:w="1275"/>
-              <w:gridCol w:w="450"/>
-              <w:gridCol w:w="450"/>
-              <w:gridCol w:w="450"/>
-              <w:gridCol w:w="450"/>
-              <w:gridCol w:w="450"/>
-              <w:gridCol w:w="450"/>
-              <w:gridCol w:w="450"/>
-              <w:gridCol w:w="450"/>
-              <w:gridCol w:w="450"/>
+              <w:gridCol w:w="1871"/>
+              <w:gridCol w:w="850"/>
+              <w:gridCol w:w="850"/>
+              <w:gridCol w:w="850"/>
+              <w:gridCol w:w="850"/>
+              <w:gridCol w:w="850"/>
+              <w:gridCol w:w="850"/>
+              <w:gridCol w:w="850"/>
+              <w:gridCol w:w="850"/>
+              <w:gridCol w:w="850"/>
             </w:tblGrid>
             <w:tr>
               <w:trPr>
@@ -21706,7 +21710,7 @@
               </w:trPr>
               <w:tc>
                 <w:tcPr>
-                  <w:tcW w:w="1275" w:type="dxa"/>
+                  <w:tcW w:w="1871" w:type="dxa"/>
                   <w:shd w:val="clear" w:color="auto" w:fill="E4E7ED"/>
                 </w:tcPr>
                 <w:p>
@@ -21758,7 +21762,7 @@
               </w:tc>
               <w:tc>
                 <w:tcPr>
-                  <w:tcW w:w="450" w:type="dxa"/>
+                  <w:tcW w:w="850" w:type="dxa"/>
                   <w:shd w:val="clear" w:color="auto" w:fill="E4E7ED"/>
                 </w:tcPr>
                 <w:p>
@@ -21776,7 +21780,7 @@
               </w:tc>
               <w:tc>
                 <w:tcPr>
-                  <w:tcW w:w="450" w:type="dxa"/>
+                  <w:tcW w:w="850" w:type="dxa"/>
                   <w:shd w:val="clear" w:color="auto" w:fill="E4E7ED"/>
                 </w:tcPr>
                 <w:p>
@@ -21794,7 +21798,7 @@
               </w:tc>
               <w:tc>
                 <w:tcPr>
-                  <w:tcW w:w="450" w:type="dxa"/>
+                  <w:tcW w:w="850" w:type="dxa"/>
                   <w:shd w:val="clear" w:color="auto" w:fill="E4E7ED"/>
                 </w:tcPr>
                 <w:p>
@@ -21812,7 +21816,7 @@
               </w:tc>
               <w:tc>
                 <w:tcPr>
-                  <w:tcW w:w="450" w:type="dxa"/>
+                  <w:tcW w:w="850" w:type="dxa"/>
                   <w:shd w:val="clear" w:color="auto" w:fill="E4E7ED"/>
                 </w:tcPr>
                 <w:p>
@@ -21830,7 +21834,7 @@
               </w:tc>
               <w:tc>
                 <w:tcPr>
-                  <w:tcW w:w="450" w:type="dxa"/>
+                  <w:tcW w:w="850" w:type="dxa"/>
                   <w:shd w:val="clear" w:color="auto" w:fill="E4E7ED"/>
                 </w:tcPr>
                 <w:p>
@@ -21848,7 +21852,7 @@
               </w:tc>
               <w:tc>
                 <w:tcPr>
-                  <w:tcW w:w="450" w:type="dxa"/>
+                  <w:tcW w:w="850" w:type="dxa"/>
                   <w:shd w:val="clear" w:color="auto" w:fill="E4E7ED"/>
                 </w:tcPr>
                 <w:p>
@@ -21866,7 +21870,7 @@
               </w:tc>
               <w:tc>
                 <w:tcPr>
-                  <w:tcW w:w="450" w:type="dxa"/>
+                  <w:tcW w:w="850" w:type="dxa"/>
                   <w:shd w:val="clear" w:color="auto" w:fill="E4E7ED"/>
                 </w:tcPr>
                 <w:p>
@@ -21884,7 +21888,7 @@
               </w:tc>
               <w:tc>
                 <w:tcPr>
-                  <w:tcW w:w="450" w:type="dxa"/>
+                  <w:tcW w:w="850" w:type="dxa"/>
                   <w:shd w:val="clear" w:color="auto" w:fill="E4E7ED"/>
                 </w:tcPr>
                 <w:p>
@@ -21902,7 +21906,7 @@
               </w:tc>
               <w:tc>
                 <w:tcPr>
-                  <w:tcW w:w="450" w:type="dxa"/>
+                  <w:tcW w:w="850" w:type="dxa"/>
                   <w:shd w:val="clear" w:color="auto" w:fill="E4E7ED"/>
                 </w:tcPr>
                 <w:p>
@@ -21922,7 +21926,7 @@
             <w:tr>
               <w:tc>
                 <w:tcPr>
-                  <w:tcW w:w="1275" w:type="dxa"/>
+                  <w:tcW w:w="1871" w:type="dxa"/>
                 </w:tcPr>
                 <w:p>
                   <w:pPr>
@@ -21976,7 +21980,7 @@
               </w:tc>
               <w:tc>
                 <w:tcPr>
-                  <w:tcW w:w="450" w:type="dxa"/>
+                  <w:tcW w:w="850" w:type="dxa"/>
                 </w:tcPr>
                 <w:p>
                   <w:pPr>
@@ -21993,7 +21997,7 @@
               </w:tc>
               <w:tc>
                 <w:tcPr>
-                  <w:tcW w:w="450" w:type="dxa"/>
+                  <w:tcW w:w="850" w:type="dxa"/>
                 </w:tcPr>
                 <w:p>
                   <w:pPr>
@@ -22010,7 +22014,7 @@
               </w:tc>
               <w:tc>
                 <w:tcPr>
-                  <w:tcW w:w="450" w:type="dxa"/>
+                  <w:tcW w:w="850" w:type="dxa"/>
                 </w:tcPr>
                 <w:p>
                   <w:pPr>
@@ -22027,7 +22031,7 @@
               </w:tc>
               <w:tc>
                 <w:tcPr>
-                  <w:tcW w:w="450" w:type="dxa"/>
+                  <w:tcW w:w="850" w:type="dxa"/>
                 </w:tcPr>
                 <w:p>
                   <w:pPr>
@@ -22044,7 +22048,7 @@
               </w:tc>
               <w:tc>
                 <w:tcPr>
-                  <w:tcW w:w="450" w:type="dxa"/>
+                  <w:tcW w:w="850" w:type="dxa"/>
                 </w:tcPr>
                 <w:p>
                   <w:pPr>
@@ -22061,7 +22065,7 @@
               </w:tc>
               <w:tc>
                 <w:tcPr>
-                  <w:tcW w:w="450" w:type="dxa"/>
+                  <w:tcW w:w="850" w:type="dxa"/>
                 </w:tcPr>
                 <w:p>
                   <w:pPr>
@@ -22078,7 +22082,7 @@
               </w:tc>
               <w:tc>
                 <w:tcPr>
-                  <w:tcW w:w="450" w:type="dxa"/>
+                  <w:tcW w:w="850" w:type="dxa"/>
                 </w:tcPr>
                 <w:p>
                   <w:pPr>
@@ -22095,7 +22099,7 @@
               </w:tc>
               <w:tc>
                 <w:tcPr>
-                  <w:tcW w:w="450" w:type="dxa"/>
+                  <w:tcW w:w="850" w:type="dxa"/>
                 </w:tcPr>
                 <w:p>
                   <w:pPr>
@@ -22112,7 +22116,7 @@
               </w:tc>
               <w:tc>
                 <w:tcPr>
-                  <w:tcW w:w="450" w:type="dxa"/>
+                  <w:tcW w:w="850" w:type="dxa"/>
                 </w:tcPr>
                 <w:p>
                   <w:pPr>
@@ -22131,7 +22135,7 @@
             <w:tr>
               <w:tc>
                 <w:tcPr>
-                  <w:tcW w:w="1275" w:type="dxa"/>
+                  <w:tcW w:w="1871" w:type="dxa"/>
                 </w:tcPr>
                 <w:p>
                   <w:pPr>
@@ -22188,7 +22192,7 @@
               </w:tc>
               <w:tc>
                 <w:tcPr>
-                  <w:tcW w:w="450" w:type="dxa"/>
+                  <w:tcW w:w="850" w:type="dxa"/>
                 </w:tcPr>
                 <w:p>
                   <w:pPr>
@@ -22205,7 +22209,7 @@
               </w:tc>
               <w:tc>
                 <w:tcPr>
-                  <w:tcW w:w="450" w:type="dxa"/>
+                  <w:tcW w:w="850" w:type="dxa"/>
                 </w:tcPr>
                 <w:p>
                   <w:pPr>
@@ -22222,7 +22226,7 @@
               </w:tc>
               <w:tc>
                 <w:tcPr>
-                  <w:tcW w:w="450" w:type="dxa"/>
+                  <w:tcW w:w="850" w:type="dxa"/>
                 </w:tcPr>
                 <w:p>
                   <w:pPr>
@@ -22239,7 +22243,7 @@
               </w:tc>
               <w:tc>
                 <w:tcPr>
-                  <w:tcW w:w="450" w:type="dxa"/>
+                  <w:tcW w:w="850" w:type="dxa"/>
                 </w:tcPr>
                 <w:p>
                   <w:pPr>
@@ -22256,7 +22260,7 @@
               </w:tc>
               <w:tc>
                 <w:tcPr>
-                  <w:tcW w:w="450" w:type="dxa"/>
+                  <w:tcW w:w="850" w:type="dxa"/>
                 </w:tcPr>
                 <w:p>
                   <w:pPr>
@@ -22273,7 +22277,7 @@
               </w:tc>
               <w:tc>
                 <w:tcPr>
-                  <w:tcW w:w="450" w:type="dxa"/>
+                  <w:tcW w:w="850" w:type="dxa"/>
                 </w:tcPr>
                 <w:p>
                   <w:pPr>
@@ -22290,7 +22294,7 @@
               </w:tc>
               <w:tc>
                 <w:tcPr>
-                  <w:tcW w:w="450" w:type="dxa"/>
+                  <w:tcW w:w="850" w:type="dxa"/>
                 </w:tcPr>
                 <w:p>
                   <w:pPr>
@@ -22307,7 +22311,7 @@
               </w:tc>
               <w:tc>
                 <w:tcPr>
-                  <w:tcW w:w="450" w:type="dxa"/>
+                  <w:tcW w:w="850" w:type="dxa"/>
                 </w:tcPr>
                 <w:p>
                   <w:pPr>
@@ -22324,7 +22328,7 @@
               </w:tc>
               <w:tc>
                 <w:tcPr>
-                  <w:tcW w:w="450" w:type="dxa"/>
+                  <w:tcW w:w="850" w:type="dxa"/>
                 </w:tcPr>
                 <w:p>
                   <w:pPr>
@@ -22344,6 +22348,7 @@
           <w:p>
             <w:pPr>
               <w:bidi/>
+              <w:spacing w:before="120"/>
             </w:pPr>
             <w:r>
               <w:rPr>
@@ -42610,7 +42615,7 @@
           <w:tbl>
             <w:tblPr>
               <w:tblStyle w:val="Table"/>
-              <w:tblW w:w="3300" w:type="dxa"/>
+              <w:tblW w:w="5380" w:type="dxa"/>
               <w:jc w:val="center"/>
               <w:tblBorders>
                 <w:top w:val="single" w:sz="4" w:space="0" w:color="000000"/>
@@ -42624,10 +42629,10 @@
               <w:tblLook w:firstRow="1" w:lastRow="0" w:firstColumn="0" w:lastColumn="0" w:noHBand="0" w:noVBand="0" w:val="0020"/>
             </w:tblPr>
             <w:tblGrid>
-              <w:gridCol w:w="1125"/>
-              <w:gridCol w:w="525"/>
-              <w:gridCol w:w="825"/>
-              <w:gridCol w:w="825"/>
+              <w:gridCol w:w="1725"/>
+              <w:gridCol w:w="965"/>
+              <w:gridCol w:w="1345"/>
+              <w:gridCol w:w="1345"/>
             </w:tblGrid>
             <w:tr>
               <w:trPr>
@@ -42635,7 +42640,7 @@
               </w:trPr>
               <w:tc>
                 <w:tcPr>
-                  <w:tcW w:w="1125" w:type="dxa"/>
+                  <w:tcW w:w="1725" w:type="dxa"/>
                   <w:shd w:val="clear" w:color="auto" w:fill="E4E7ED"/>
                 </w:tcPr>
                 <w:p>
@@ -42665,7 +42670,7 @@
               </w:tc>
               <w:tc>
                 <w:tcPr>
-                  <w:tcW w:w="525" w:type="dxa"/>
+                  <w:tcW w:w="965" w:type="dxa"/>
                   <w:shd w:val="clear" w:color="auto" w:fill="E4E7ED"/>
                 </w:tcPr>
                 <w:p>
@@ -42686,7 +42691,7 @@
               </w:tc>
               <w:tc>
                 <w:tcPr>
-                  <w:tcW w:w="825" w:type="dxa"/>
+                  <w:tcW w:w="1345" w:type="dxa"/>
                   <w:shd w:val="clear" w:color="auto" w:fill="E4E7ED"/>
                 </w:tcPr>
                 <w:p>
@@ -42716,7 +42721,7 @@
               </w:tc>
               <w:tc>
                 <w:tcPr>
-                  <w:tcW w:w="825" w:type="dxa"/>
+                  <w:tcW w:w="1345" w:type="dxa"/>
                   <w:shd w:val="clear" w:color="auto" w:fill="E4E7ED"/>
                 </w:tcPr>
                 <w:p>
@@ -42748,7 +42753,7 @@
             <w:tr>
               <w:tc>
                 <w:tcPr>
-                  <w:tcW w:w="1125" w:type="dxa"/>
+                  <w:tcW w:w="1725" w:type="dxa"/>
                 </w:tcPr>
                 <w:p>
                   <w:pPr>
@@ -42802,7 +42807,7 @@
               </w:tc>
               <w:tc>
                 <w:tcPr>
-                  <w:tcW w:w="525" w:type="dxa"/>
+                  <w:tcW w:w="965" w:type="dxa"/>
                 </w:tcPr>
                 <w:p>
                   <w:pPr>
@@ -42819,7 +42824,7 @@
               </w:tc>
               <w:tc>
                 <w:tcPr>
-                  <w:tcW w:w="825" w:type="dxa"/>
+                  <w:tcW w:w="1345" w:type="dxa"/>
                 </w:tcPr>
                 <w:p>
                   <w:pPr>
@@ -42836,7 +42841,7 @@
               </w:tc>
               <w:tc>
                 <w:tcPr>
-                  <w:tcW w:w="825" w:type="dxa"/>
+                  <w:tcW w:w="1345" w:type="dxa"/>
                 </w:tcPr>
                 <w:p>
                   <w:pPr>
@@ -42856,6 +42861,7 @@
           <w:p>
             <w:pPr>
               <w:bidi/>
+              <w:spacing w:before="120"/>
             </w:pPr>
             <w:r>
               <w:rPr>

</xml_diff>

<commit_message>
tex2docx: merge Windows-side fixes (circled, Rec, hl, cline, checkmark, \no, cases with Arabic, math in titles)
Co-Authored-By: Claude Opus 5.5 <noreply@anthropic.com>
Claude-Session: https://claude.ai/code/session_015WVgZKTbSWpZTjn6aZsqC9
</commit_message>
<xml_diff>
--- a/documents/arithmetique/molakhas_arith_3as.docx
+++ b/documents/arithmetique/molakhas_arith_3as.docx
@@ -4982,6 +4982,9 @@
             </w:pPr>
             <m:oMath>
               <m:r>
+                <m:t>​</m:t>
+              </m:r>
+              <m:r>
                 <m:t>a</m:t>
               </m:r>
               <m:r>
@@ -5013,6 +5016,9 @@
               <w:t xml:space="preserve"> و </w:t>
             </w:r>
             <m:oMath>
+              <m:r>
+                <m:t>​</m:t>
+              </m:r>
               <m:r>
                 <m:t>0</m:t>
               </m:r>

</xml_diff>

<commit_message>
Arithmetic summary: remove Fermat's little theorem (not in the official program)
Co-Authored-By: Claude Opus 5.5 <noreply@anthropic.com>
Claude-Session: https://claude.ai/code/session_015WVgZKTbSWpZTjn6aZsqC9
</commit_message>
<xml_diff>
--- a/documents/arithmetique/molakhas_arith_3as.docx
+++ b/documents/arithmetique/molakhas_arith_3as.docx
@@ -33725,341 +33725,6 @@
         <w:tblW w:w="9864" w:type="dxa"/>
         <w:jc w:val="center"/>
         <w:tblBorders>
-          <w:top w:val="single" w:sz="10" w:space="0" w:color="8F1E18"/>
-          <w:left w:val="single" w:sz="10" w:space="0" w:color="8F1E18"/>
-          <w:bottom w:val="single" w:sz="10" w:space="0" w:color="8F1E18"/>
-          <w:right w:val="single" w:sz="10" w:space="0" w:color="8F1E18"/>
-          <w:insideH w:val="single" w:sz="10" w:space="0" w:color="8F1E18"/>
-        </w:tblBorders>
-        <w:tblLayout w:type="fixed"/>
-        <w:tblCellMar>
-          <w:top w:w="40" w:type="dxa"/>
-          <w:left w:w="140" w:type="dxa"/>
-          <w:bottom w:w="60" w:type="dxa"/>
-          <w:right w:w="140" w:type="dxa"/>
-        </w:tblCellMar>
-      </w:tblPr>
-      <w:tblGrid>
-        <w:gridCol w:w="9864"/>
-      </w:tblGrid>
-      <w:tr>
-        <w:trPr>
-          <w:cantSplit/>
-        </w:trPr>
-        <w:tc>
-          <w:tcPr>
-            <w:tcW w:w="9864" w:type="dxa"/>
-            <w:shd w:val="clear" w:color="auto" w:fill="8F1E18"/>
-          </w:tcPr>
-          <w:p>
-            <w:pPr>
-              <w:keepNext/>
-              <w:bidi/>
-              <w:spacing w:before="0" w:after="0"/>
-            </w:pPr>
-            <w:r>
-              <w:rPr>
-                <w:b/>
-                <w:bCs/>
-                <w:color w:val="FFFFFF"/>
-                <w:rtl/>
-              </w:rPr>
-              <w:t xml:space="preserve">مبرهنة فيرما الصغرى (شعبة رياضيات)</w:t>
-            </w:r>
-          </w:p>
-        </w:tc>
-      </w:tr>
-      <w:tr>
-        <w:tc>
-          <w:tcPr>
-            <w:tcW w:w="9864" w:type="dxa"/>
-            <w:shd w:val="clear" w:color="auto" w:fill="FBF4F4"/>
-          </w:tcPr>
-          <w:p>
-            <w:pPr>
-              <w:bidi/>
-            </w:pPr>
-            <w:r>
-              <w:rPr>
-                <w:rtl/>
-              </w:rPr>
-              <w:t xml:space="preserve">إذا كان</w:t>
-            </w:r>
-            <w:r>
-              <w:rPr>
-                <w:rtl/>
-              </w:rPr>
-              <w:t xml:space="preserve"> </w:t>
-            </w:r>
-            <m:oMath>
-              <m:r>
-                <w:rPr>
-                  <w:color w:val="1F4E9C"/>
-                </w:rPr>
-                <m:t>p</m:t>
-              </m:r>
-            </m:oMath>
-            <w:r>
-              <w:rPr>
-                <w:rtl/>
-              </w:rPr>
-              <w:t xml:space="preserve"> </w:t>
-            </w:r>
-            <w:r>
-              <w:rPr>
-                <w:rtl/>
-              </w:rPr>
-              <w:t xml:space="preserve">عددًا أوليًا و</w:t>
-            </w:r>
-            <w:r>
-              <w:rPr>
-                <w:rtl/>
-              </w:rPr>
-              <w:t xml:space="preserve"> </w:t>
-            </w:r>
-            <m:oMath>
-              <m:r>
-                <w:rPr>
-                  <w:color w:val="1F4E9C"/>
-                </w:rPr>
-                <m:t>a</m:t>
-              </m:r>
-            </m:oMath>
-            <w:r>
-              <w:rPr>
-                <w:rtl/>
-              </w:rPr>
-              <w:t xml:space="preserve"> </w:t>
-            </w:r>
-            <w:r>
-              <w:rPr>
-                <w:rtl/>
-              </w:rPr>
-              <w:t xml:space="preserve">عددًا صحيحًا لا يقبل القسمة على</w:t>
-            </w:r>
-            <w:r>
-              <w:rPr>
-                <w:rtl/>
-              </w:rPr>
-              <w:t xml:space="preserve"> </w:t>
-            </w:r>
-            <m:oMath>
-              <m:r>
-                <w:rPr>
-                  <w:color w:val="1F4E9C"/>
-                </w:rPr>
-                <m:t>p</m:t>
-              </m:r>
-            </m:oMath>
-            <w:r>
-              <w:rPr>
-                <w:rtl/>
-              </w:rPr>
-              <w:t xml:space="preserve"> </w:t>
-            </w:r>
-            <w:r>
-              <w:rPr>
-                <w:rtl/>
-              </w:rPr>
-              <w:t xml:space="preserve">فإن:</w:t>
-            </w:r>
-          </w:p>
-          <w:p>
-            <w:pPr>
-              <w:bidi/>
-            </w:pPr>
-            <m:oMathPara>
-              <m:oMathParaPr>
-                <m:jc m:val="center"/>
-              </m:oMathParaPr>
-              <m:oMath>
-                <m:sSup>
-                  <m:e>
-                    <m:r>
-                      <w:rPr>
-                        <w:color w:val="1F4E9C"/>
-                      </w:rPr>
-                      <m:t>a</m:t>
-                    </m:r>
-                  </m:e>
-                  <m:sup>
-                    <m:r>
-                      <w:rPr>
-                        <w:color w:val="1F4E9C"/>
-                      </w:rPr>
-                      <m:t>p</m:t>
-                    </m:r>
-                    <m:r>
-                      <m:rPr>
-                        <m:sty m:val="p"/>
-                      </m:rPr>
-                      <w:rPr>
-                        <w:color w:val="1F4E9C"/>
-                      </w:rPr>
-                      <m:t>−</m:t>
-                    </m:r>
-                    <m:r>
-                      <w:rPr>
-                        <w:color w:val="1F4E9C"/>
-                      </w:rPr>
-                      <m:t>1</m:t>
-                    </m:r>
-                  </m:sup>
-                </m:sSup>
-                <m:r>
-                  <m:rPr>
-                    <m:sty m:val="p"/>
-                  </m:rPr>
-                  <w:rPr>
-                    <w:color w:val="1F4E9C"/>
-                  </w:rPr>
-                  <m:t>≡</m:t>
-                </m:r>
-                <m:r>
-                  <w:rPr>
-                    <w:color w:val="1F4E9C"/>
-                  </w:rPr>
-                  <m:t>1</m:t>
-                </m:r>
-                <m:r>
-                  <w:rPr>
-                    <w:color w:val="1F4E9C"/>
-                  </w:rPr>
-                  <m:t> </m:t>
-                </m:r>
-                <m:d>
-                  <m:dPr>
-                    <m:begChr m:val="["/>
-                    <m:endChr m:val="]"/>
-                    <m:sepChr m:val=""/>
-                    <m:grow/>
-                  </m:dPr>
-                  <m:e>
-                    <m:r>
-                      <w:rPr>
-                        <w:color w:val="1F4E9C"/>
-                      </w:rPr>
-                      <m:t>p</m:t>
-                    </m:r>
-                  </m:e>
-                </m:d>
-              </m:oMath>
-            </m:oMathPara>
-          </w:p>
-          <w:p>
-            <w:pPr>
-              <w:bidi/>
-            </w:pPr>
-            <w:r>
-              <w:rPr>
-                <w:rtl/>
-              </w:rPr>
-              <w:t xml:space="preserve">ومن أجل كل عدد صحيح</w:t>
-            </w:r>
-            <w:r>
-              <w:rPr>
-                <w:rtl/>
-              </w:rPr>
-              <w:t xml:space="preserve"> </w:t>
-            </w:r>
-            <m:oMath>
-              <m:r>
-                <w:rPr>
-                  <w:color w:val="1F4E9C"/>
-                </w:rPr>
-                <m:t>a</m:t>
-              </m:r>
-            </m:oMath>
-            <w:r>
-              <w:rPr>
-                <w:rtl/>
-              </w:rPr>
-              <w:t xml:space="preserve">:</w:t>
-            </w:r>
-            <w:r>
-              <w:rPr>
-                <w:rtl/>
-              </w:rPr>
-              <w:t xml:space="preserve"> </w:t>
-            </w:r>
-            <m:oMath>
-              <m:sSup>
-                <m:e>
-                  <m:r>
-                    <w:rPr>
-                      <w:color w:val="1F4E9C"/>
-                    </w:rPr>
-                    <m:t>a</m:t>
-                  </m:r>
-                </m:e>
-                <m:sup>
-                  <m:r>
-                    <w:rPr>
-                      <w:color w:val="1F4E9C"/>
-                    </w:rPr>
-                    <m:t>p</m:t>
-                  </m:r>
-                </m:sup>
-              </m:sSup>
-              <m:r>
-                <m:rPr>
-                  <m:sty m:val="p"/>
-                </m:rPr>
-                <w:rPr>
-                  <w:color w:val="1F4E9C"/>
-                </w:rPr>
-                <m:t>≡</m:t>
-              </m:r>
-              <m:r>
-                <w:rPr>
-                  <w:color w:val="1F4E9C"/>
-                </w:rPr>
-                <m:t>a</m:t>
-              </m:r>
-              <m:r>
-                <w:rPr>
-                  <w:color w:val="1F4E9C"/>
-                </w:rPr>
-                <m:t> </m:t>
-              </m:r>
-              <m:d>
-                <m:dPr>
-                  <m:begChr m:val="["/>
-                  <m:endChr m:val="]"/>
-                  <m:sepChr m:val=""/>
-                  <m:grow/>
-                </m:dPr>
-                <m:e>
-                  <m:r>
-                    <w:rPr>
-                      <w:color w:val="1F4E9C"/>
-                    </w:rPr>
-                    <m:t>p</m:t>
-                  </m:r>
-                </m:e>
-              </m:d>
-            </m:oMath>
-            <w:r>
-              <w:rPr>
-                <w:rtl/>
-              </w:rPr>
-              <w:t xml:space="preserve">.</w:t>
-            </w:r>
-          </w:p>
-        </w:tc>
-      </w:tr>
-    </w:tbl>
-    <w:p>
-      <w:pPr>
-        <w:bidi/>
-        <w:spacing w:before="0" w:after="0"/>
-      </w:pPr>
-    </w:p>
-    <w:tbl>
-      <w:tblPr>
-        <w:tblW w:w="9864" w:type="dxa"/>
-        <w:jc w:val="center"/>
-        <w:tblBorders>
           <w:top w:val="single" w:sz="10" w:space="0" w:color="9F5600"/>
           <w:left w:val="single" w:sz="10" w:space="0" w:color="9F5600"/>
           <w:bottom w:val="single" w:sz="10" w:space="0" w:color="9F5600"/>
@@ -34185,69 +33850,6 @@
               <w:bidi/>
             </w:pPr>
             <m:oMath>
-              <m:r>
-                <m:t>7</m:t>
-              </m:r>
-            </m:oMath>
-            <w:r>
-              <w:rPr>
-                <w:rtl/>
-              </w:rPr>
-              <w:t xml:space="preserve"> </w:t>
-            </w:r>
-            <w:r>
-              <w:rPr>
-                <w:rtl/>
-              </w:rPr>
-              <w:t xml:space="preserve">أولي و</w:t>
-            </w:r>
-            <w:r>
-              <w:rPr>
-                <w:rtl/>
-              </w:rPr>
-              <w:t xml:space="preserve"> </w:t>
-            </w:r>
-            <m:oMath>
-              <m:r>
-                <m:t>7</m:t>
-              </m:r>
-            </m:oMath>
-            <w:r>
-              <w:rPr>
-                <w:rtl/>
-              </w:rPr>
-              <w:t xml:space="preserve"> </w:t>
-            </w:r>
-            <w:r>
-              <w:rPr>
-                <w:rtl/>
-              </w:rPr>
-              <w:t xml:space="preserve">لا يقسم</w:t>
-            </w:r>
-            <w:r>
-              <w:rPr>
-                <w:rtl/>
-              </w:rPr>
-              <w:t xml:space="preserve"> </w:t>
-            </w:r>
-            <m:oMath>
-              <m:r>
-                <m:t>3</m:t>
-              </m:r>
-            </m:oMath>
-            <w:r>
-              <w:rPr>
-                <w:rtl/>
-              </w:rPr>
-              <w:t xml:space="preserve">، إذن حسب مبرهنة فيرما</w:t>
-            </w:r>
-            <w:r>
-              <w:rPr>
-                <w:rtl/>
-              </w:rPr>
-              <w:t xml:space="preserve"> </w:t>
-            </w:r>
-            <m:oMath>
               <m:sSup>
                 <m:e>
                   <m:r>
@@ -34256,7 +33858,7 @@
                 </m:e>
                 <m:sup>
                   <m:r>
-                    <m:t>6</m:t>
+                    <m:t>3</m:t>
                   </m:r>
                 </m:sup>
               </m:sSup>
@@ -34264,7 +33866,22 @@
                 <m:rPr>
                   <m:sty m:val="p"/>
                 </m:rPr>
+                <m:t>=</m:t>
+              </m:r>
+              <m:r>
+                <m:t>27</m:t>
+              </m:r>
+              <m:r>
+                <m:rPr>
+                  <m:sty m:val="p"/>
+                </m:rPr>
                 <m:t>≡</m:t>
+              </m:r>
+              <m:r>
+                <m:rPr>
+                  <m:sty m:val="p"/>
+                </m:rPr>
+                <m:t>−</m:t>
               </m:r>
               <m:r>
                 <m:t>1</m:t>
@@ -34285,6 +33902,145 @@
                   </m:r>
                 </m:e>
               </m:d>
+            </m:oMath>
+            <w:r>
+              <w:rPr>
+                <w:rtl/>
+              </w:rPr>
+              <w:t xml:space="preserve">، إذن</w:t>
+            </w:r>
+            <w:r>
+              <w:rPr>
+                <w:rtl/>
+              </w:rPr>
+              <w:t xml:space="preserve"> </w:t>
+            </w:r>
+            <m:oMath>
+              <m:sSup>
+                <m:e>
+                  <m:r>
+                    <m:t>3</m:t>
+                  </m:r>
+                </m:e>
+                <m:sup>
+                  <m:r>
+                    <m:t>6</m:t>
+                  </m:r>
+                </m:sup>
+              </m:sSup>
+              <m:r>
+                <m:rPr>
+                  <m:sty m:val="p"/>
+                </m:rPr>
+                <m:t>=</m:t>
+              </m:r>
+              <m:sSup>
+                <m:e>
+                  <m:d>
+                    <m:dPr>
+                      <m:begChr m:val="("/>
+                      <m:endChr m:val=")"/>
+                      <m:sepChr m:val=""/>
+                      <m:grow/>
+                    </m:dPr>
+                    <m:e>
+                      <m:sSup>
+                        <m:e>
+                          <m:r>
+                            <m:t>3</m:t>
+                          </m:r>
+                        </m:e>
+                        <m:sup>
+                          <m:r>
+                            <m:t>3</m:t>
+                          </m:r>
+                        </m:sup>
+                      </m:sSup>
+                    </m:e>
+                  </m:d>
+                </m:e>
+                <m:sup>
+                  <m:r>
+                    <m:t>2</m:t>
+                  </m:r>
+                </m:sup>
+              </m:sSup>
+              <m:r>
+                <m:rPr>
+                  <m:sty m:val="p"/>
+                </m:rPr>
+                <m:t>≡</m:t>
+              </m:r>
+              <m:sSup>
+                <m:e>
+                  <m:d>
+                    <m:dPr>
+                      <m:begChr m:val="("/>
+                      <m:endChr m:val=")"/>
+                      <m:sepChr m:val=""/>
+                      <m:grow/>
+                    </m:dPr>
+                    <m:e>
+                      <m:r>
+                        <m:rPr>
+                          <m:sty m:val="p"/>
+                        </m:rPr>
+                        <m:t>−</m:t>
+                      </m:r>
+                      <m:r>
+                        <m:t>1</m:t>
+                      </m:r>
+                    </m:e>
+                  </m:d>
+                </m:e>
+                <m:sup>
+                  <m:r>
+                    <m:t>2</m:t>
+                  </m:r>
+                </m:sup>
+              </m:sSup>
+              <m:r>
+                <m:rPr>
+                  <m:sty m:val="p"/>
+                </m:rPr>
+                <m:t>=</m:t>
+              </m:r>
+              <m:r>
+                <m:t>1</m:t>
+              </m:r>
+              <m:r>
+                <m:t> </m:t>
+              </m:r>
+              <m:d>
+                <m:dPr>
+                  <m:begChr m:val="["/>
+                  <m:endChr m:val="]"/>
+                  <m:sepChr m:val=""/>
+                  <m:grow/>
+                </m:dPr>
+                <m:e>
+                  <m:r>
+                    <m:t>7</m:t>
+                  </m:r>
+                </m:e>
+              </m:d>
+            </m:oMath>
+            <w:r>
+              <w:rPr>
+                <w:rtl/>
+              </w:rPr>
+              <w:t xml:space="preserve">: البواقي دورية دورها</w:t>
+            </w:r>
+            <w:r>
+              <w:rPr>
+                <w:rtl/>
+              </w:rPr>
+              <w:t xml:space="preserve"> </w:t>
+            </w:r>
+            <m:oMath>
+              <m:r>
+                <m:t>6</m:t>
+              </m:r>
             </m:oMath>
             <w:r>
               <w:rPr>
@@ -54893,134 +54649,6 @@
                 <m:t>n</m:t>
               </m:r>
             </m:oMath>
-          </w:p>
-        </w:tc>
-      </w:tr>
-      <w:tr>
-        <w:tc>
-          <w:tcPr/>
-          <w:p>
-            <w:pPr>
-              <w:pStyle w:val="Compact"/>
-              <w:bidi/>
-              <w:jc w:val="left"/>
-            </w:pPr>
-            <m:oMath>
-              <m:sSup>
-                <m:e>
-                  <m:r>
-                    <m:t>a</m:t>
-                  </m:r>
-                </m:e>
-                <m:sup>
-                  <m:r>
-                    <m:t>p</m:t>
-                  </m:r>
-                  <m:r>
-                    <m:rPr>
-                      <m:sty m:val="p"/>
-                    </m:rPr>
-                    <m:t>−</m:t>
-                  </m:r>
-                  <m:r>
-                    <m:t>1</m:t>
-                  </m:r>
-                </m:sup>
-              </m:sSup>
-              <m:r>
-                <m:rPr>
-                  <m:sty m:val="p"/>
-                </m:rPr>
-                <m:t>≡</m:t>
-              </m:r>
-              <m:r>
-                <m:t>1</m:t>
-              </m:r>
-              <m:r>
-                <m:t> </m:t>
-              </m:r>
-              <m:d>
-                <m:dPr>
-                  <m:begChr m:val="["/>
-                  <m:endChr m:val="]"/>
-                  <m:sepChr m:val=""/>
-                  <m:grow/>
-                </m:dPr>
-                <m:e>
-                  <m:r>
-                    <m:t>p</m:t>
-                  </m:r>
-                </m:e>
-              </m:d>
-            </m:oMath>
-            <w:r>
-              <w:rPr>
-                <w:rtl/>
-              </w:rPr>
-              <w:t xml:space="preserve"> </w:t>
-            </w:r>
-            <w:r>
-              <w:rPr>
-                <w:rtl/>
-              </w:rPr>
-              <w:t xml:space="preserve">إذا كان</w:t>
-            </w:r>
-            <w:r>
-              <w:rPr>
-                <w:rtl/>
-              </w:rPr>
-              <w:t xml:space="preserve"> </w:t>
-            </w:r>
-            <m:oMath>
-              <m:r>
-                <m:t>p</m:t>
-              </m:r>
-            </m:oMath>
-            <w:r>
-              <w:rPr>
-                <w:rtl/>
-              </w:rPr>
-              <w:t xml:space="preserve"> </w:t>
-            </w:r>
-            <w:r>
-              <w:rPr>
-                <w:rtl/>
-              </w:rPr>
-              <w:t xml:space="preserve">أوليًا لا يقسم</w:t>
-            </w:r>
-            <w:r>
-              <w:rPr>
-                <w:rtl/>
-              </w:rPr>
-              <w:t xml:space="preserve"> </w:t>
-            </w:r>
-            <m:oMath>
-              <m:r>
-                <m:t>a</m:t>
-              </m:r>
-            </m:oMath>
-            <w:r>
-              <w:rPr>
-                <w:rtl/>
-              </w:rPr>
-              <w:t xml:space="preserve">.</w:t>
-            </w:r>
-          </w:p>
-        </w:tc>
-        <w:tc>
-          <w:tcPr/>
-          <w:p>
-            <w:pPr>
-              <w:pStyle w:val="Compact"/>
-              <w:bidi/>
-              <w:jc w:val="left"/>
-            </w:pPr>
-            <w:r>
-              <w:rPr>
-                <w:rtl/>
-              </w:rPr>
-              <w:t xml:space="preserve">مبرهنة فيرما</w:t>
-            </w:r>
           </w:p>
         </w:tc>
       </w:tr>

</xml_diff>